<commit_message>
Link the assignment sheets from the syllabus
The syllabus pointed Low-Stakes 1 at a page that was never built, and the
signature assignment had no link at all. Both now point at the published
portfolio pages, and both resolve.

The grade table capstone cell is merged across two columns, so it is written
once rather than twice.
</commit_message>
<xml_diff>
--- a/1-UCF-ENG4237/ENG4237 Syllabus.docx
+++ b/1-UCF-ENG4237/ENG4237 Syllabus.docx
@@ -6579,20 +6579,22 @@
             </w:r>
           </w:p>
           <w:p>
-            <w:pPr>
-              <w:spacing w:before="100" w:beforeAutospacing="1" w:after="100" w:afterAutospacing="1"/>
-              <w:rPr>
-                <w:rFonts w:ascii="Arial Narrow" w:hAnsi="Arial Narrow"/>
-                <w:color w:val="000000"/>
-              </w:rPr>
-            </w:pPr>
-            <w:r>
-              <w:rPr>
-                <w:rFonts w:ascii="Arial Narrow" w:hAnsi="Arial Narrow"/>
-                <w:color w:val="000000"/>
-              </w:rPr>
-              <w:t xml:space="preserve">This is either an AI-generated artifact with your own writing, or a non-AI physical artifact you design. Everyone makes something: there is no writing-only path through this assignment.</w:t>
-            </w:r>
+            <w:pPr/>
+            <w:r>
+              <w:rPr>
+                <w:rFonts w:ascii="Arial Narrow" w:hAnsi="Arial Narrow"/>
+              </w:rPr>
+              <w:t xml:space="preserve">This is either an AI-generated artifact with your own writing, or a non-AI physical artifact you design. Everyone makes something: there is no writing-only path through this assignment. </w:t>
+            </w:r>
+            <w:hyperlink r:id="rId57">
+              <w:r>
+                <w:rPr>
+                  <w:color w:val="0000E9"/>
+                  <w:u w:val="single"/>
+                </w:rPr>
+                <w:t xml:space="preserve">(full assignment sheet)</w:t>
+              </w:r>
+            </w:hyperlink>
           </w:p>
         </w:tc>
         <w:tc>

</xml_diff>

<commit_message>
Repair five corrupted citations and stop spawning tabs
The five readings added to section 4 each carried a leftover URL from the row
they were cloned from, so their citations ran into a second address with no
space: "...doi.org/10.1086/685115.https://dhdebates...". Runs nested inside a
<w:hyperlink> are invisible to python-docx Paragraph.runs, so clearing the runs
left the old link in place and it reappended itself after the new text. The
helper now removes the hyperlink elements outright. This was a defect in the
Word document, not only on the site.

Links between the portfolio and the syllabus site no longer open new tabs.
Both are hers; moving between them should feel like one place rather than
stacking a tab per click. Genuinely third-party links -- readings, tools --
still open away from the page.
</commit_message>
<xml_diff>
--- a/1-UCF-ENG4237/ENG4237 Syllabus.docx
+++ b/1-UCF-ENG4237/ENG4237 Syllabus.docx
@@ -1339,7 +1339,7 @@
                 <w:rFonts w:ascii="Arial Narrow" w:hAnsi="Arial Narrow"/>
                 <w:color w:val="000000"/>
               </w:rPr>
-              <w:t>Crenshaw, Kimberlé. “Mapping the Margins: Intersectionality, Identity Politics, and Violence against Women of Color.” Stanford Law Review, vol. 43, no. 6, 1991, pp. 1241–99, https://doi.org/10.2307/1229039.https://dhdebates.gc.cuny.edu/read/untitled-88c11800-9446-469b-a3be-3fdb36bfbd1e/section/f5640d43-b8eb-4d49-bc4b-eb31a16f3d06</w:t>
+              <w:t>Crenshaw, Kimberlé. “Mapping the Margins: Intersectionality, Identity Politics, and Violence against Women of Color.” Stanford Law Review, vol. 43, no. 6, 1991, pp. 1241–99, https://doi.org/10.2307/1229039.</w:t>
             </w:r>
             <w:r>
               <w:rPr>
@@ -1355,31 +1355,6 @@
                 <w:color w:val="000000"/>
               </w:rPr>
             </w:r>
-            <w:hyperlink r:id="rId12" w:history="1">
-              <w:r>
-                <w:rPr>
-                  <w:rStyle w:val="Hyperlink"/>
-                  <w:rFonts w:ascii="Arial Narrow" w:hAnsi="Arial Narrow"/>
-                </w:rPr>
-                <w:t>chicagounbound.uchicago.edu/</w:t>
-              </w:r>
-              <w:proofErr w:type="spellStart"/>
-              <w:r>
-                <w:rPr>
-                  <w:rStyle w:val="Hyperlink"/>
-                  <w:rFonts w:ascii="Arial Narrow" w:hAnsi="Arial Narrow"/>
-                </w:rPr>
-                <w:t>uclf</w:t>
-              </w:r>
-              <w:proofErr w:type="spellEnd"/>
-              <w:r>
-                <w:rPr>
-                  <w:rStyle w:val="Hyperlink"/>
-                  <w:rFonts w:ascii="Arial Narrow" w:hAnsi="Arial Narrow"/>
-                </w:rPr>
-                <w:t>/vol1989/iss1/8</w:t>
-              </w:r>
-            </w:hyperlink>
             <w:r>
               <w:rPr>
                 <w:rFonts w:ascii="Arial Narrow" w:hAnsi="Arial Narrow"/>
@@ -2027,16 +2002,6 @@
                 <w:color w:val="000000"/>
               </w:rPr>
             </w:r>
-            <w:hyperlink r:id="rId6" w:history="1"/>
-            <w:hyperlink r:id="rId7" w:history="1">
-              <w:r>
-                <w:rPr>
-                  <w:rStyle w:val="Hyperlink"/>
-                  <w:rFonts w:ascii="Arial Narrow" w:hAnsi="Arial Narrow"/>
-                </w:rPr>
-                <w:t>https://dhdebates.gc.cuny.edu/read/untitled-88c11800-9446-469b-a3be-3fdb36bfbd1e/section/f5640d43-b8eb-4d49-bc4b-eb31a16f3d06</w:t>
-              </w:r>
-            </w:hyperlink>
           </w:p>
         </w:tc>
       </w:tr>
@@ -2096,16 +2061,6 @@
                 <w:color w:val="000000"/>
               </w:rPr>
             </w:r>
-            <w:hyperlink r:id="rId6" w:history="1"/>
-            <w:hyperlink r:id="rId7" w:history="1">
-              <w:r>
-                <w:rPr>
-                  <w:rStyle w:val="Hyperlink"/>
-                  <w:rFonts w:ascii="Arial Narrow" w:hAnsi="Arial Narrow"/>
-                </w:rPr>
-                <w:t>https://dhdebates.gc.cuny.edu/read/untitled-88c11800-9446-469b-a3be-3fdb36bfbd1e/section/f5640d43-b8eb-4d49-bc4b-eb31a16f3d06</w:t>
-              </w:r>
-            </w:hyperlink>
           </w:p>
         </w:tc>
       </w:tr>
@@ -2200,16 +2155,6 @@
                 <w:color w:val="000000"/>
               </w:rPr>
             </w:r>
-            <w:hyperlink r:id="rId6" w:history="1"/>
-            <w:hyperlink r:id="rId7" w:history="1">
-              <w:r>
-                <w:rPr>
-                  <w:rStyle w:val="Hyperlink"/>
-                  <w:rFonts w:ascii="Arial Narrow" w:hAnsi="Arial Narrow"/>
-                </w:rPr>
-                <w:t>https://dhdebates.gc.cuny.edu/read/untitled-88c11800-9446-469b-a3be-3fdb36bfbd1e/section/f5640d43-b8eb-4d49-bc4b-eb31a16f3d06</w:t>
-              </w:r>
-            </w:hyperlink>
           </w:p>
         </w:tc>
       </w:tr>
@@ -2269,16 +2214,6 @@
                 <w:color w:val="000000"/>
               </w:rPr>
             </w:r>
-            <w:hyperlink r:id="rId6" w:history="1"/>
-            <w:hyperlink r:id="rId7" w:history="1">
-              <w:r>
-                <w:rPr>
-                  <w:rStyle w:val="Hyperlink"/>
-                  <w:rFonts w:ascii="Arial Narrow" w:hAnsi="Arial Narrow"/>
-                </w:rPr>
-                <w:t>https://dhdebates.gc.cuny.edu/read/untitled-88c11800-9446-469b-a3be-3fdb36bfbd1e/section/f5640d43-b8eb-4d49-bc4b-eb31a16f3d06</w:t>
-              </w:r>
-            </w:hyperlink>
           </w:p>
         </w:tc>
       </w:tr>
@@ -5200,17 +5135,6 @@
                 <w:color w:val="000000"/>
               </w:rPr>
             </w:pPr>
-            <w:hyperlink r:id="rId43" w:history="1">
-              <w:r>
-                <w:rPr>
-                  <w:rStyle w:val="Hyperlink"/>
-                  <w:rFonts w:ascii="Arial Narrow" w:hAnsi="Arial Narrow"/>
-                  <w:b/>
-                  <w:bCs/>
-                </w:rPr>
-                <w:t>ChatGPT</w:t>
-              </w:r>
-            </w:hyperlink>
             <w:r>
               <w:t>Stable Diffusion</w:t>
             </w:r>
@@ -5328,17 +5252,6 @@
                 <w:color w:val="000000"/>
               </w:rPr>
             </w:pPr>
-            <w:hyperlink r:id="rId43" w:history="1">
-              <w:r>
-                <w:rPr>
-                  <w:rStyle w:val="Hyperlink"/>
-                  <w:rFonts w:ascii="Arial Narrow" w:hAnsi="Arial Narrow"/>
-                  <w:b/>
-                  <w:bCs/>
-                </w:rPr>
-                <w:t>ChatGPT</w:t>
-              </w:r>
-            </w:hyperlink>
             <w:r>
               <w:t>DeepL</w:t>
             </w:r>

</xml_diff>